<commit_message>
Add final report links and model checkpoint
</commit_message>
<xml_diff>
--- a/HW1_实验报告.docx
+++ b/HW1_实验报告.docx
@@ -2209,7 +2209,7 @@
         <w:pStyle w:val="Compact"/>
       </w:pPr>
       <w:r>
-        <w:t xml:space="preserve">待补充</w:t>
+        <w:t xml:space="preserve">https://github.com/jiab666/cvhw</w:t>
       </w:r>
     </w:p>
     <w:p>
@@ -2229,7 +2229,7 @@
         <w:pStyle w:val="Compact"/>
       </w:pPr>
       <w:r>
-        <w:t xml:space="preserve">待补充</w:t>
+        <w:t xml:space="preserve">https://github.com/jiab666/cvhw/blob/main/outputs/final_run/best_model.npz</w:t>
       </w:r>
     </w:p>
     <w:bookmarkEnd w:id="38"/>

</xml_diff>

<commit_message>
Update homework report links and upload search results
</commit_message>
<xml_diff>
--- a/HW1_实验报告.docx
+++ b/HW1_实验报告.docx
@@ -958,7 +958,7 @@
         <w:pStyle w:val="FirstParagraph"/>
       </w:pPr>
       <w:r>
-        <w:t xml:space="preserve">为了比较不同超参数组合对性能的影响，实验对隐藏层维度和激活函数进行了一个小规模网格搜索，其他参数固定为：</w:t>
+        <w:t xml:space="preserve">为了比较不同超参数组合对性能的影响，实验采用网格搜索调节了以下三类核心超参数：</w:t>
       </w:r>
     </w:p>
     <w:p>
@@ -970,10 +970,16 @@
         <w:pStyle w:val="Compact"/>
       </w:pPr>
       <w:r>
-        <w:rPr>
-          <w:rStyle w:val="VerbatimChar"/>
-        </w:rPr>
-        <w:t xml:space="preserve">learning_rate = 0.05</w:t>
+        <w:t xml:space="preserve">隐藏层维度</w:t>
+      </w:r>
+      <w:r>
+        <w:t xml:space="preserve"> </w:t>
+      </w:r>
+      <w:r>
+        <w:rPr>
+          <w:rStyle w:val="VerbatimChar"/>
+        </w:rPr>
+        <w:t xml:space="preserve">hidden_dim</w:t>
       </w:r>
     </w:p>
     <w:p>
@@ -985,10 +991,16 @@
         <w:pStyle w:val="Compact"/>
       </w:pPr>
       <w:r>
-        <w:rPr>
-          <w:rStyle w:val="VerbatimChar"/>
-        </w:rPr>
-        <w:t xml:space="preserve">weight_decay = 1e-4</w:t>
+        <w:t xml:space="preserve">学习率</w:t>
+      </w:r>
+      <w:r>
+        <w:t xml:space="preserve"> </w:t>
+      </w:r>
+      <w:r>
+        <w:rPr>
+          <w:rStyle w:val="VerbatimChar"/>
+        </w:rPr>
+        <w:t xml:space="preserve">learning_rate</w:t>
       </w:r>
     </w:p>
     <w:p>
@@ -1000,15 +1012,53 @@
         <w:pStyle w:val="Compact"/>
       </w:pPr>
       <w:r>
-        <w:rPr>
-          <w:rStyle w:val="VerbatimChar"/>
-        </w:rPr>
-        <w:t xml:space="preserve">epochs = 8</w:t>
+        <w:t xml:space="preserve">正则化强度</w:t>
+      </w:r>
+      <w:r>
+        <w:t xml:space="preserve"> </w:t>
+      </w:r>
+      <w:r>
+        <w:rPr>
+          <w:rStyle w:val="VerbatimChar"/>
+        </w:rPr>
+        <w:t xml:space="preserve">weight_decay</w:t>
       </w:r>
     </w:p>
     <w:p>
       <w:pPr>
         <w:pStyle w:val="FirstParagraph"/>
+      </w:pPr>
+      <w:r>
+        <w:t xml:space="preserve">为了控制实验规模，激活函数固定为</w:t>
+      </w:r>
+      <w:r>
+        <w:t xml:space="preserve"> </w:t>
+      </w:r>
+      <w:r>
+        <w:rPr>
+          <w:rStyle w:val="VerbatimChar"/>
+        </w:rPr>
+        <w:t xml:space="preserve">ReLU</w:t>
+      </w:r>
+      <w:r>
+        <w:t xml:space="preserve">，训练轮数固定为</w:t>
+      </w:r>
+      <w:r>
+        <w:t xml:space="preserve"> </w:t>
+      </w:r>
+      <w:r>
+        <w:rPr>
+          <w:rStyle w:val="VerbatimChar"/>
+        </w:rPr>
+        <w:t xml:space="preserve">8</w:t>
+      </w:r>
+      <w:r>
+        <w:t xml:space="preserve">。</w:t>
+      </w:r>
+    </w:p>
+    <w:p>
+      <w:pPr>
+        <w:pStyle w:val="BodyText"/>
       </w:pPr>
       <w:r>
         <w:t xml:space="preserve">实验结果如下：</w:t>
@@ -1119,18 +1169,18 @@
               <w:jc w:val="left"/>
             </w:pPr>
             <w:r>
-              <w:t xml:space="preserve">1e-4</w:t>
-            </w:r>
-          </w:p>
-        </w:tc>
-        <w:tc>
-          <w:p>
-            <w:pPr>
-              <w:pStyle w:val="Compact"/>
-              <w:jc w:val="left"/>
-            </w:pPr>
-            <w:r>
-              <w:t xml:space="preserve">0.8877</w:t>
+              <w:t xml:space="preserve">0.0</w:t>
+            </w:r>
+          </w:p>
+        </w:tc>
+        <w:tc>
+          <w:p>
+            <w:pPr>
+              <w:pStyle w:val="Compact"/>
+              <w:jc w:val="left"/>
+            </w:pPr>
+            <w:r>
+              <w:t xml:space="preserve">0.8928</w:t>
             </w:r>
           </w:p>
         </w:tc>
@@ -1154,7 +1204,7 @@
               <w:jc w:val="left"/>
             </w:pPr>
             <w:r>
-              <w:t xml:space="preserve">tanh</w:t>
+              <w:t xml:space="preserve">relu</w:t>
             </w:r>
           </w:p>
         </w:tc>
@@ -1187,7 +1237,7 @@
               <w:jc w:val="left"/>
             </w:pPr>
             <w:r>
-              <w:t xml:space="preserve">0.8868</w:t>
+              <w:t xml:space="preserve">0.8923</w:t>
             </w:r>
           </w:p>
         </w:tc>
@@ -1244,7 +1294,7 @@
               <w:jc w:val="left"/>
             </w:pPr>
             <w:r>
-              <w:t xml:space="preserve">0.8860</w:t>
+              <w:t xml:space="preserve">0.8890</w:t>
             </w:r>
           </w:p>
         </w:tc>
@@ -1268,7 +1318,7 @@
               <w:jc w:val="left"/>
             </w:pPr>
             <w:r>
-              <w:t xml:space="preserve">tanh</w:t>
+              <w:t xml:space="preserve">relu</w:t>
             </w:r>
           </w:p>
         </w:tc>
@@ -1290,6 +1340,63 @@
               <w:jc w:val="left"/>
             </w:pPr>
             <w:r>
+              <w:t xml:space="preserve">0.0</w:t>
+            </w:r>
+          </w:p>
+        </w:tc>
+        <w:tc>
+          <w:p>
+            <w:pPr>
+              <w:pStyle w:val="Compact"/>
+              <w:jc w:val="left"/>
+            </w:pPr>
+            <w:r>
+              <w:t xml:space="preserve">0.8845</w:t>
+            </w:r>
+          </w:p>
+        </w:tc>
+      </w:tr>
+      <w:tr>
+        <w:tc>
+          <w:p>
+            <w:pPr>
+              <w:pStyle w:val="Compact"/>
+              <w:jc w:val="left"/>
+            </w:pPr>
+            <w:r>
+              <w:t xml:space="preserve">256</w:t>
+            </w:r>
+          </w:p>
+        </w:tc>
+        <w:tc>
+          <w:p>
+            <w:pPr>
+              <w:pStyle w:val="Compact"/>
+              <w:jc w:val="left"/>
+            </w:pPr>
+            <w:r>
+              <w:t xml:space="preserve">relu</w:t>
+            </w:r>
+          </w:p>
+        </w:tc>
+        <w:tc>
+          <w:p>
+            <w:pPr>
+              <w:pStyle w:val="Compact"/>
+              <w:jc w:val="left"/>
+            </w:pPr>
+            <w:r>
+              <w:t xml:space="preserve">0.01</w:t>
+            </w:r>
+          </w:p>
+        </w:tc>
+        <w:tc>
+          <w:p>
+            <w:pPr>
+              <w:pStyle w:val="Compact"/>
+              <w:jc w:val="left"/>
+            </w:pPr>
+            <w:r>
               <w:t xml:space="preserve">1e-4</w:t>
             </w:r>
           </w:p>
@@ -1301,7 +1408,178 @@
               <w:jc w:val="left"/>
             </w:pPr>
             <w:r>
-              <w:t xml:space="preserve">0.8845</w:t>
+              <w:t xml:space="preserve">0.8743</w:t>
+            </w:r>
+          </w:p>
+        </w:tc>
+      </w:tr>
+      <w:tr>
+        <w:tc>
+          <w:p>
+            <w:pPr>
+              <w:pStyle w:val="Compact"/>
+              <w:jc w:val="left"/>
+            </w:pPr>
+            <w:r>
+              <w:t xml:space="preserve">256</w:t>
+            </w:r>
+          </w:p>
+        </w:tc>
+        <w:tc>
+          <w:p>
+            <w:pPr>
+              <w:pStyle w:val="Compact"/>
+              <w:jc w:val="left"/>
+            </w:pPr>
+            <w:r>
+              <w:t xml:space="preserve">relu</w:t>
+            </w:r>
+          </w:p>
+        </w:tc>
+        <w:tc>
+          <w:p>
+            <w:pPr>
+              <w:pStyle w:val="Compact"/>
+              <w:jc w:val="left"/>
+            </w:pPr>
+            <w:r>
+              <w:t xml:space="preserve">0.01</w:t>
+            </w:r>
+          </w:p>
+        </w:tc>
+        <w:tc>
+          <w:p>
+            <w:pPr>
+              <w:pStyle w:val="Compact"/>
+              <w:jc w:val="left"/>
+            </w:pPr>
+            <w:r>
+              <w:t xml:space="preserve">0.0</w:t>
+            </w:r>
+          </w:p>
+        </w:tc>
+        <w:tc>
+          <w:p>
+            <w:pPr>
+              <w:pStyle w:val="Compact"/>
+              <w:jc w:val="left"/>
+            </w:pPr>
+            <w:r>
+              <w:t xml:space="preserve">0.8735</w:t>
+            </w:r>
+          </w:p>
+        </w:tc>
+      </w:tr>
+      <w:tr>
+        <w:tc>
+          <w:p>
+            <w:pPr>
+              <w:pStyle w:val="Compact"/>
+              <w:jc w:val="left"/>
+            </w:pPr>
+            <w:r>
+              <w:t xml:space="preserve">128</w:t>
+            </w:r>
+          </w:p>
+        </w:tc>
+        <w:tc>
+          <w:p>
+            <w:pPr>
+              <w:pStyle w:val="Compact"/>
+              <w:jc w:val="left"/>
+            </w:pPr>
+            <w:r>
+              <w:t xml:space="preserve">relu</w:t>
+            </w:r>
+          </w:p>
+        </w:tc>
+        <w:tc>
+          <w:p>
+            <w:pPr>
+              <w:pStyle w:val="Compact"/>
+              <w:jc w:val="left"/>
+            </w:pPr>
+            <w:r>
+              <w:t xml:space="preserve">0.01</w:t>
+            </w:r>
+          </w:p>
+        </w:tc>
+        <w:tc>
+          <w:p>
+            <w:pPr>
+              <w:pStyle w:val="Compact"/>
+              <w:jc w:val="left"/>
+            </w:pPr>
+            <w:r>
+              <w:t xml:space="preserve">1e-4</w:t>
+            </w:r>
+          </w:p>
+        </w:tc>
+        <w:tc>
+          <w:p>
+            <w:pPr>
+              <w:pStyle w:val="Compact"/>
+              <w:jc w:val="left"/>
+            </w:pPr>
+            <w:r>
+              <w:t xml:space="preserve">0.8688</w:t>
+            </w:r>
+          </w:p>
+        </w:tc>
+      </w:tr>
+      <w:tr>
+        <w:tc>
+          <w:p>
+            <w:pPr>
+              <w:pStyle w:val="Compact"/>
+              <w:jc w:val="left"/>
+            </w:pPr>
+            <w:r>
+              <w:t xml:space="preserve">128</w:t>
+            </w:r>
+          </w:p>
+        </w:tc>
+        <w:tc>
+          <w:p>
+            <w:pPr>
+              <w:pStyle w:val="Compact"/>
+              <w:jc w:val="left"/>
+            </w:pPr>
+            <w:r>
+              <w:t xml:space="preserve">relu</w:t>
+            </w:r>
+          </w:p>
+        </w:tc>
+        <w:tc>
+          <w:p>
+            <w:pPr>
+              <w:pStyle w:val="Compact"/>
+              <w:jc w:val="left"/>
+            </w:pPr>
+            <w:r>
+              <w:t xml:space="preserve">0.01</w:t>
+            </w:r>
+          </w:p>
+        </w:tc>
+        <w:tc>
+          <w:p>
+            <w:pPr>
+              <w:pStyle w:val="Compact"/>
+              <w:jc w:val="left"/>
+            </w:pPr>
+            <w:r>
+              <w:t xml:space="preserve">0.0</w:t>
+            </w:r>
+          </w:p>
+        </w:tc>
+        <w:tc>
+          <w:p>
+            <w:pPr>
+              <w:pStyle w:val="Compact"/>
+              <w:jc w:val="left"/>
+            </w:pPr>
+            <w:r>
+              <w:t xml:space="preserve">0.8610</w:t>
             </w:r>
           </w:p>
         </w:tc>
@@ -1324,7 +1602,7 @@
         <w:pStyle w:val="Compact"/>
       </w:pPr>
       <w:r>
-        <w:t xml:space="preserve">较大的隐藏层维度通常带来更高的验证集准确率。</w:t>
+        <w:t xml:space="preserve">较大的隐藏层维度通常带来更高的验证集准确率，说明更宽的隐藏层具备更强的表示能力。</w:t>
       </w:r>
     </w:p>
     <w:p>
@@ -1336,28 +1614,34 @@
         <w:pStyle w:val="Compact"/>
       </w:pPr>
       <w:r>
-        <w:rPr>
-          <w:rStyle w:val="VerbatimChar"/>
-        </w:rPr>
-        <w:t xml:space="preserve">ReLU</w:t>
-      </w:r>
-      <w:r>
-        <w:t xml:space="preserve"> </w:t>
-      </w:r>
-      <w:r>
-        <w:t xml:space="preserve">整体略优于</w:t>
-      </w:r>
-      <w:r>
-        <w:t xml:space="preserve"> </w:t>
-      </w:r>
-      <w:r>
-        <w:rPr>
-          <w:rStyle w:val="VerbatimChar"/>
-        </w:rPr>
-        <w:t xml:space="preserve">Tanh</w:t>
-      </w:r>
-      <w:r>
-        <w:t xml:space="preserve">，收敛速度也更快。</w:t>
+        <w:t xml:space="preserve">较大的学习率</w:t>
+      </w:r>
+      <w:r>
+        <w:t xml:space="preserve"> </w:t>
+      </w:r>
+      <w:r>
+        <w:rPr>
+          <w:rStyle w:val="VerbatimChar"/>
+        </w:rPr>
+        <w:t xml:space="preserve">0.05</w:t>
+      </w:r>
+      <w:r>
+        <w:t xml:space="preserve"> </w:t>
+      </w:r>
+      <w:r>
+        <w:t xml:space="preserve">明显优于</w:t>
+      </w:r>
+      <w:r>
+        <w:t xml:space="preserve"> </w:t>
+      </w:r>
+      <w:r>
+        <w:rPr>
+          <w:rStyle w:val="VerbatimChar"/>
+        </w:rPr>
+        <w:t xml:space="preserve">0.01</w:t>
+      </w:r>
+      <w:r>
+        <w:t xml:space="preserve">，说明在当前模型和数据集上，更积极的更新步长能更快达到较好解。</w:t>
       </w:r>
     </w:p>
     <w:p>
@@ -1369,7 +1653,46 @@
         <w:pStyle w:val="Compact"/>
       </w:pPr>
       <w:r>
-        <w:t xml:space="preserve">在本次实验设置下，</w:t>
+        <w:rPr>
+          <w:rStyle w:val="VerbatimChar"/>
+        </w:rPr>
+        <w:t xml:space="preserve">weight_decay = 0.0</w:t>
+      </w:r>
+      <w:r>
+        <w:t xml:space="preserve"> </w:t>
+      </w:r>
+      <w:r>
+        <w:t xml:space="preserve">和</w:t>
+      </w:r>
+      <w:r>
+        <w:t xml:space="preserve"> </w:t>
+      </w:r>
+      <w:r>
+        <w:rPr>
+          <w:rStyle w:val="VerbatimChar"/>
+        </w:rPr>
+        <w:t xml:space="preserve">1e-4</w:t>
+      </w:r>
+      <w:r>
+        <w:t xml:space="preserve"> </w:t>
+      </w:r>
+      <w:r>
+        <w:t xml:space="preserve">的差距不大，但在不同隐藏层设置下都能观察到轻微影响，说明正则化强度也会改变模型表现。</w:t>
+      </w:r>
+    </w:p>
+    <w:p>
+      <w:pPr>
+        <w:numPr>
+          <w:ilvl w:val="0"/>
+          <w:numId w:val="1006"/>
+        </w:numPr>
+        <w:pStyle w:val="Compact"/>
+      </w:pPr>
+      <w:r>
+        <w:t xml:space="preserve">在本次搜索中，最佳组合为</w:t>
+      </w:r>
+      <w:r>
+        <w:t xml:space="preserve"> </w:t>
       </w:r>
       <w:r>
         <w:rPr>
@@ -1378,25 +1701,60 @@
         <w:t xml:space="preserve">hidden_dim = 256</w:t>
       </w:r>
       <w:r>
-        <w:t xml:space="preserve"> </w:t>
-      </w:r>
-      <w:r>
-        <w:t xml:space="preserve">与</w:t>
-      </w:r>
-      <w:r>
-        <w:t xml:space="preserve"> </w:t>
-      </w:r>
-      <w:r>
-        <w:rPr>
-          <w:rStyle w:val="VerbatimChar"/>
-        </w:rPr>
-        <w:t xml:space="preserve">ReLU</w:t>
-      </w:r>
-      <w:r>
-        <w:t xml:space="preserve"> </w:t>
-      </w:r>
-      <w:r>
-        <w:t xml:space="preserve">的组合效果最好。</w:t>
+        <w:t xml:space="preserve">、</w:t>
+      </w:r>
+      <w:r>
+        <w:rPr>
+          <w:rStyle w:val="VerbatimChar"/>
+        </w:rPr>
+        <w:t xml:space="preserve">learning_rate = 0.05</w:t>
+      </w:r>
+      <w:r>
+        <w:t xml:space="preserve">、</w:t>
+      </w:r>
+      <w:r>
+        <w:rPr>
+          <w:rStyle w:val="VerbatimChar"/>
+        </w:rPr>
+        <w:t xml:space="preserve">weight_decay = 0.0</w:t>
+      </w:r>
+      <w:r>
+        <w:t xml:space="preserve">，验证集准确率达到</w:t>
+      </w:r>
+      <w:r>
+        <w:t xml:space="preserve"> </w:t>
+      </w:r>
+      <w:r>
+        <w:rPr>
+          <w:rStyle w:val="VerbatimChar"/>
+        </w:rPr>
+        <w:t xml:space="preserve">0.8928</w:t>
+      </w:r>
+      <w:r>
+        <w:t xml:space="preserve">。</w:t>
+      </w:r>
+    </w:p>
+    <w:p>
+      <w:pPr>
+        <w:pStyle w:val="FirstParagraph"/>
+      </w:pPr>
+      <w:r>
+        <w:t xml:space="preserve">搜索结果保存在：</w:t>
+      </w:r>
+    </w:p>
+    <w:p>
+      <w:pPr>
+        <w:numPr>
+          <w:ilvl w:val="0"/>
+          <w:numId w:val="1007"/>
+        </w:numPr>
+        <w:pStyle w:val="Compact"/>
+      </w:pPr>
+      <w:r>
+        <w:rPr>
+          <w:rStyle w:val="VerbatimChar"/>
+        </w:rPr>
+        <w:t xml:space="preserve">outputs/search_required/search_results.json</w:t>
       </w:r>
     </w:p>
     <w:bookmarkEnd w:id="30"/>
@@ -1421,7 +1779,7 @@
       <w:pPr>
         <w:numPr>
           <w:ilvl w:val="0"/>
-          <w:numId w:val="1007"/>
+          <w:numId w:val="1008"/>
         </w:numPr>
         <w:pStyle w:val="Compact"/>
       </w:pPr>
@@ -1436,7 +1794,7 @@
       <w:pPr>
         <w:numPr>
           <w:ilvl w:val="0"/>
-          <w:numId w:val="1007"/>
+          <w:numId w:val="1008"/>
         </w:numPr>
         <w:pStyle w:val="Compact"/>
       </w:pPr>
@@ -1522,7 +1880,7 @@
       <w:pPr>
         <w:numPr>
           <w:ilvl w:val="0"/>
-          <w:numId w:val="1008"/>
+          <w:numId w:val="1009"/>
         </w:numPr>
         <w:pStyle w:val="Compact"/>
       </w:pPr>
@@ -1561,7 +1919,7 @@
       <w:pPr>
         <w:numPr>
           <w:ilvl w:val="0"/>
-          <w:numId w:val="1008"/>
+          <w:numId w:val="1009"/>
         </w:numPr>
         <w:pStyle w:val="Compact"/>
       </w:pPr>
@@ -1612,7 +1970,7 @@
       <w:pPr>
         <w:numPr>
           <w:ilvl w:val="0"/>
-          <w:numId w:val="1008"/>
+          <w:numId w:val="1009"/>
         </w:numPr>
         <w:pStyle w:val="Compact"/>
       </w:pPr>
@@ -1648,7 +2006,7 @@
       <w:pPr>
         <w:numPr>
           <w:ilvl w:val="0"/>
-          <w:numId w:val="1008"/>
+          <w:numId w:val="1009"/>
         </w:numPr>
         <w:pStyle w:val="Compact"/>
       </w:pPr>
@@ -1798,7 +2156,7 @@
       <w:pPr>
         <w:numPr>
           <w:ilvl w:val="0"/>
-          <w:numId w:val="1009"/>
+          <w:numId w:val="1010"/>
         </w:numPr>
         <w:pStyle w:val="Compact"/>
       </w:pPr>
@@ -1810,7 +2168,7 @@
       <w:pPr>
         <w:numPr>
           <w:ilvl w:val="0"/>
-          <w:numId w:val="1009"/>
+          <w:numId w:val="1010"/>
         </w:numPr>
         <w:pStyle w:val="Compact"/>
       </w:pPr>
@@ -1822,7 +2180,7 @@
       <w:pPr>
         <w:numPr>
           <w:ilvl w:val="0"/>
-          <w:numId w:val="1009"/>
+          <w:numId w:val="1010"/>
         </w:numPr>
         <w:pStyle w:val="Compact"/>
       </w:pPr>
@@ -1923,7 +2281,7 @@
       <w:pPr>
         <w:numPr>
           <w:ilvl w:val="0"/>
-          <w:numId w:val="1010"/>
+          <w:numId w:val="1011"/>
         </w:numPr>
         <w:pStyle w:val="Compact"/>
       </w:pPr>
@@ -1959,7 +2317,7 @@
       <w:pPr>
         <w:numPr>
           <w:ilvl w:val="0"/>
-          <w:numId w:val="1010"/>
+          <w:numId w:val="1011"/>
         </w:numPr>
         <w:pStyle w:val="Compact"/>
       </w:pPr>
@@ -1998,7 +2356,7 @@
       <w:pPr>
         <w:numPr>
           <w:ilvl w:val="0"/>
-          <w:numId w:val="1010"/>
+          <w:numId w:val="1011"/>
         </w:numPr>
         <w:pStyle w:val="Compact"/>
       </w:pPr>
@@ -2010,7 +2368,7 @@
       <w:pPr>
         <w:numPr>
           <w:ilvl w:val="0"/>
-          <w:numId w:val="1010"/>
+          <w:numId w:val="1011"/>
         </w:numPr>
         <w:pStyle w:val="Compact"/>
       </w:pPr>
@@ -2123,7 +2481,7 @@
       <w:pPr>
         <w:numPr>
           <w:ilvl w:val="0"/>
-          <w:numId w:val="1011"/>
+          <w:numId w:val="1012"/>
         </w:numPr>
         <w:pStyle w:val="Compact"/>
       </w:pPr>
@@ -2135,7 +2493,7 @@
       <w:pPr>
         <w:numPr>
           <w:ilvl w:val="0"/>
-          <w:numId w:val="1011"/>
+          <w:numId w:val="1012"/>
         </w:numPr>
         <w:pStyle w:val="Compact"/>
       </w:pPr>
@@ -2147,7 +2505,7 @@
       <w:pPr>
         <w:numPr>
           <w:ilvl w:val="0"/>
-          <w:numId w:val="1011"/>
+          <w:numId w:val="1012"/>
         </w:numPr>
         <w:pStyle w:val="Compact"/>
       </w:pPr>
@@ -2174,7 +2532,7 @@
       <w:pPr>
         <w:numPr>
           <w:ilvl w:val="0"/>
-          <w:numId w:val="1011"/>
+          <w:numId w:val="1012"/>
         </w:numPr>
         <w:pStyle w:val="Compact"/>
       </w:pPr>
@@ -2204,7 +2562,7 @@
       <w:pPr>
         <w:numPr>
           <w:ilvl w:val="0"/>
-          <w:numId w:val="1012"/>
+          <w:numId w:val="1013"/>
         </w:numPr>
         <w:pStyle w:val="Compact"/>
       </w:pPr>
@@ -2224,7 +2582,7 @@
       <w:pPr>
         <w:numPr>
           <w:ilvl w:val="0"/>
-          <w:numId w:val="1013"/>
+          <w:numId w:val="1014"/>
         </w:numPr>
         <w:pStyle w:val="Compact"/>
       </w:pPr>
@@ -2568,6 +2926,9 @@
     <w:abstractNumId w:val="991"/>
   </w:num>
   <w:num w:numId="1013">
+    <w:abstractNumId w:val="991"/>
+  </w:num>
+  <w:num w:numId="1014">
     <w:abstractNumId w:val="991"/>
   </w:num>
 </w:numbering>

</xml_diff>